<commit_message>
Aula 0903 - IoT - RGB e BUTTON
</commit_message>
<xml_diff>
--- a/SENAI/WORDS/3º SEMESTRE/IoT/aula03_revisao_rasp.docx
+++ b/SENAI/WORDS/3º SEMESTRE/IoT/aula03_revisao_rasp.docx
@@ -21,17 +21,7 @@
           <w:sz w:val="32"/>
           <w:szCs w:val="32"/>
         </w:rPr>
-        <w:t>AULA 0</w:t>
-      </w:r>
-      <w:r>
-        <w:rPr>
-          <w:rFonts w:ascii="Arial" w:hAnsi="Arial"/>
-          <w:b/>
-          <w:bCs/>
-          <w:sz w:val="32"/>
-          <w:szCs w:val="32"/>
-        </w:rPr>
-        <w:t>3</w:t>
+        <w:t>AULA 03</w:t>
       </w:r>
     </w:p>
     <w:p>
@@ -359,6 +349,14 @@
         </w:rPr>
         <w:t>1(faixa marrom), 6(faixa azul)</w:t>
       </w:r>
+      <w:r>
+        <w:rPr>
+          <w:rFonts w:ascii="Arial" w:hAnsi="Arial"/>
+          <w:sz w:val="28"/>
+          <w:szCs w:val="28"/>
+        </w:rPr>
+        <w:t>) = 16 ohms</w:t>
+      </w:r>
     </w:p>
     <w:p>
       <w:pPr>
@@ -397,6 +395,597 @@
         </w:rPr>
         <w:t xml:space="preserve"> 1.6K Ohms ±5% (Faixa dourada)</w:t>
       </w:r>
+    </w:p>
+    <w:p>
+      <w:pPr>
+        <w:rPr>
+          <w:rFonts w:ascii="Arial" w:hAnsi="Arial"/>
+          <w:b/>
+          <w:bCs/>
+          <w:sz w:val="28"/>
+          <w:szCs w:val="28"/>
+        </w:rPr>
+      </w:pPr>
+      <w:r>
+        <w:rPr>
+          <w:rFonts w:ascii="Arial" w:hAnsi="Arial"/>
+          <w:b/>
+          <w:bCs/>
+          <w:sz w:val="28"/>
+          <w:szCs w:val="28"/>
+        </w:rPr>
+        <w:lastRenderedPageBreak/>
+        <w:t>Sensores e Atuadores</w:t>
+      </w:r>
+    </w:p>
+    <w:p>
+      <w:pPr>
+        <w:rPr>
+          <w:rFonts w:ascii="Arial" w:hAnsi="Arial"/>
+          <w:b/>
+          <w:bCs/>
+          <w:sz w:val="28"/>
+          <w:szCs w:val="28"/>
+        </w:rPr>
+      </w:pPr>
+      <w:r>
+        <w:rPr>
+          <w:rFonts w:ascii="Arial" w:hAnsi="Arial"/>
+          <w:b/>
+          <w:bCs/>
+          <w:sz w:val="28"/>
+          <w:szCs w:val="28"/>
+        </w:rPr>
+        <w:t>Atuadores</w:t>
+      </w:r>
+    </w:p>
+    <w:p>
+      <w:pPr>
+        <w:rPr>
+          <w:rFonts w:ascii="Arial" w:hAnsi="Arial"/>
+          <w:sz w:val="28"/>
+          <w:szCs w:val="28"/>
+        </w:rPr>
+      </w:pPr>
+      <w:r>
+        <w:rPr>
+          <w:rFonts w:ascii="Arial" w:hAnsi="Arial"/>
+          <w:sz w:val="28"/>
+          <w:szCs w:val="28"/>
+        </w:rPr>
+        <w:t>Dispositivos que fazem uma ação física (ligar, desligar como o LED, movimento, rotação etc.)</w:t>
+      </w:r>
+      <w:r>
+        <w:rPr>
+          <w:rFonts w:ascii="Arial" w:hAnsi="Arial"/>
+          <w:sz w:val="28"/>
+          <w:szCs w:val="28"/>
+        </w:rPr>
+        <w:t xml:space="preserve"> – Resposta a comandos eletrônicos</w:t>
+      </w:r>
+    </w:p>
+    <w:p>
+      <w:pPr>
+        <w:rPr>
+          <w:rFonts w:ascii="Arial" w:hAnsi="Arial"/>
+          <w:b/>
+          <w:bCs/>
+          <w:sz w:val="28"/>
+          <w:szCs w:val="28"/>
+        </w:rPr>
+      </w:pPr>
+      <w:r>
+        <w:rPr>
+          <w:rFonts w:ascii="Arial" w:hAnsi="Arial"/>
+          <w:b/>
+          <w:bCs/>
+          <w:sz w:val="28"/>
+          <w:szCs w:val="28"/>
+        </w:rPr>
+        <w:t>PRÁTICA COM RGB</w:t>
+      </w:r>
+    </w:p>
+    <w:p>
+      <w:pPr>
+        <w:rPr>
+          <w:rFonts w:ascii="Arial" w:hAnsi="Arial"/>
+          <w:b/>
+          <w:bCs/>
+          <w:sz w:val="28"/>
+          <w:szCs w:val="28"/>
+        </w:rPr>
+      </w:pPr>
+    </w:p>
+    <w:p>
+      <w:pPr>
+        <w:rPr>
+          <w:rFonts w:ascii="Arial" w:hAnsi="Arial"/>
+          <w:b/>
+          <w:bCs/>
+          <w:sz w:val="28"/>
+          <w:szCs w:val="28"/>
+        </w:rPr>
+      </w:pPr>
+      <w:r>
+        <w:rPr>
+          <w:rFonts w:ascii="Arial" w:hAnsi="Arial"/>
+          <w:b/>
+          <w:bCs/>
+          <w:sz w:val="28"/>
+          <w:szCs w:val="28"/>
+        </w:rPr>
+        <w:t>Sensores</w:t>
+      </w:r>
+    </w:p>
+    <w:p>
+      <w:pPr>
+        <w:rPr>
+          <w:rFonts w:ascii="Arial" w:hAnsi="Arial"/>
+          <w:sz w:val="28"/>
+          <w:szCs w:val="28"/>
+        </w:rPr>
+      </w:pPr>
+      <w:r>
+        <w:rPr>
+          <w:rFonts w:ascii="Arial" w:hAnsi="Arial"/>
+          <w:sz w:val="28"/>
+          <w:szCs w:val="28"/>
+        </w:rPr>
+        <w:t xml:space="preserve">Captam informações do ambiente e transformam em sinais elétricos que são enviados ao microcontrolador (normalmente </w:t>
+      </w:r>
+      <w:proofErr w:type="spellStart"/>
+      <w:r>
+        <w:rPr>
+          <w:rFonts w:ascii="Arial" w:hAnsi="Arial"/>
+          <w:sz w:val="28"/>
+          <w:szCs w:val="28"/>
+        </w:rPr>
+        <w:t>usado</w:t>
+      </w:r>
+      <w:proofErr w:type="spellEnd"/>
+      <w:r>
+        <w:rPr>
+          <w:rFonts w:ascii="Arial" w:hAnsi="Arial"/>
+          <w:sz w:val="28"/>
+          <w:szCs w:val="28"/>
+        </w:rPr>
+        <w:t xml:space="preserve"> para </w:t>
+      </w:r>
+      <w:r>
+        <w:rPr>
+          <w:rFonts w:ascii="Arial" w:hAnsi="Arial"/>
+          <w:sz w:val="28"/>
+          <w:szCs w:val="28"/>
+        </w:rPr>
+        <w:t>utilizar atuadores)</w:t>
+      </w:r>
+    </w:p>
+    <w:p>
+      <w:pPr>
+        <w:rPr>
+          <w:rFonts w:ascii="Arial" w:hAnsi="Arial"/>
+          <w:sz w:val="28"/>
+          <w:szCs w:val="28"/>
+        </w:rPr>
+      </w:pPr>
+      <w:r>
+        <w:rPr>
+          <w:rFonts w:ascii="Arial" w:hAnsi="Arial"/>
+          <w:sz w:val="28"/>
+          <w:szCs w:val="28"/>
+        </w:rPr>
+        <w:t>Ex.: Potenciômetro</w:t>
+      </w:r>
+      <w:r>
+        <w:rPr>
+          <w:rFonts w:ascii="Arial" w:hAnsi="Arial"/>
+          <w:sz w:val="28"/>
+          <w:szCs w:val="28"/>
+        </w:rPr>
+        <w:t>, sensor de temperatura (DHT22), sensor ultrassônico</w:t>
+      </w:r>
+      <w:r>
+        <w:rPr>
+          <w:rFonts w:ascii="Arial" w:hAnsi="Arial"/>
+          <w:sz w:val="28"/>
+          <w:szCs w:val="28"/>
+        </w:rPr>
+        <w:t xml:space="preserve">, </w:t>
+      </w:r>
+      <w:proofErr w:type="spellStart"/>
+      <w:r>
+        <w:rPr>
+          <w:rFonts w:ascii="Arial" w:hAnsi="Arial"/>
+          <w:sz w:val="28"/>
+          <w:szCs w:val="28"/>
+        </w:rPr>
+        <w:t>p</w:t>
+      </w:r>
+      <w:r>
+        <w:rPr>
+          <w:rFonts w:ascii="Arial" w:hAnsi="Arial"/>
+          <w:sz w:val="28"/>
+          <w:szCs w:val="28"/>
+        </w:rPr>
+        <w:t>ushbutton</w:t>
+      </w:r>
+      <w:proofErr w:type="spellEnd"/>
+      <w:r>
+        <w:rPr>
+          <w:rFonts w:ascii="Arial" w:hAnsi="Arial"/>
+          <w:sz w:val="28"/>
+          <w:szCs w:val="28"/>
+        </w:rPr>
+        <w:t>...</w:t>
+      </w:r>
+    </w:p>
+    <w:p>
+      <w:pPr>
+        <w:rPr>
+          <w:rFonts w:ascii="Arial" w:hAnsi="Arial"/>
+          <w:sz w:val="28"/>
+          <w:szCs w:val="28"/>
+        </w:rPr>
+      </w:pPr>
+    </w:p>
+    <w:p>
+      <w:pPr>
+        <w:rPr>
+          <w:rFonts w:ascii="Arial" w:hAnsi="Arial"/>
+          <w:sz w:val="28"/>
+          <w:szCs w:val="28"/>
+        </w:rPr>
+      </w:pPr>
+      <w:proofErr w:type="spellStart"/>
+      <w:r>
+        <w:rPr>
+          <w:rFonts w:ascii="Arial" w:hAnsi="Arial"/>
+          <w:b/>
+          <w:bCs/>
+          <w:sz w:val="28"/>
+          <w:szCs w:val="28"/>
+        </w:rPr>
+        <w:t>Pushbutton</w:t>
+      </w:r>
+      <w:proofErr w:type="spellEnd"/>
+    </w:p>
+    <w:p>
+      <w:pPr>
+        <w:rPr>
+          <w:rFonts w:ascii="Arial" w:hAnsi="Arial"/>
+          <w:sz w:val="28"/>
+          <w:szCs w:val="28"/>
+        </w:rPr>
+      </w:pPr>
+      <w:proofErr w:type="spellStart"/>
+      <w:r>
+        <w:rPr>
+          <w:rFonts w:ascii="Arial" w:hAnsi="Arial"/>
+          <w:sz w:val="28"/>
+          <w:szCs w:val="28"/>
+        </w:rPr>
+        <w:t>Pull-Up</w:t>
+      </w:r>
+      <w:proofErr w:type="spellEnd"/>
+      <w:r>
+        <w:rPr>
+          <w:rFonts w:ascii="Arial" w:hAnsi="Arial"/>
+          <w:sz w:val="28"/>
+          <w:szCs w:val="28"/>
+        </w:rPr>
+        <w:t xml:space="preserve">: Botão se mantém </w:t>
+      </w:r>
+      <w:r>
+        <w:rPr>
+          <w:rFonts w:ascii="Arial" w:hAnsi="Arial"/>
+          <w:sz w:val="28"/>
+          <w:szCs w:val="28"/>
+        </w:rPr>
+        <w:t>“</w:t>
+      </w:r>
+      <w:r>
+        <w:rPr>
+          <w:rFonts w:ascii="Arial" w:hAnsi="Arial"/>
+          <w:sz w:val="28"/>
+          <w:szCs w:val="28"/>
+        </w:rPr>
+        <w:t>ligado</w:t>
+      </w:r>
+      <w:r>
+        <w:rPr>
+          <w:rFonts w:ascii="Arial" w:hAnsi="Arial"/>
+          <w:sz w:val="28"/>
+          <w:szCs w:val="28"/>
+        </w:rPr>
+        <w:t>”</w:t>
+      </w:r>
+      <w:r>
+        <w:rPr>
+          <w:rFonts w:ascii="Arial" w:hAnsi="Arial"/>
+          <w:sz w:val="28"/>
+          <w:szCs w:val="28"/>
+        </w:rPr>
+        <w:t xml:space="preserve"> até apertar</w:t>
+      </w:r>
+      <w:r>
+        <w:rPr>
+          <w:rFonts w:ascii="Arial" w:hAnsi="Arial"/>
+          <w:sz w:val="28"/>
+          <w:szCs w:val="28"/>
+        </w:rPr>
+        <w:t xml:space="preserve"> (manter segurado)</w:t>
+      </w:r>
+    </w:p>
+    <w:p>
+      <w:pPr>
+        <w:rPr>
+          <w:rFonts w:ascii="Arial" w:hAnsi="Arial"/>
+          <w:sz w:val="28"/>
+          <w:szCs w:val="28"/>
+        </w:rPr>
+      </w:pPr>
+      <w:proofErr w:type="spellStart"/>
+      <w:r>
+        <w:rPr>
+          <w:rFonts w:ascii="Arial" w:hAnsi="Arial"/>
+          <w:sz w:val="28"/>
+          <w:szCs w:val="28"/>
+        </w:rPr>
+        <w:t>Pull</w:t>
+      </w:r>
+      <w:proofErr w:type="spellEnd"/>
+      <w:r>
+        <w:rPr>
+          <w:rFonts w:ascii="Arial" w:hAnsi="Arial"/>
+          <w:sz w:val="28"/>
+          <w:szCs w:val="28"/>
+        </w:rPr>
+        <w:t xml:space="preserve">-Down: </w:t>
+      </w:r>
+      <w:r>
+        <w:rPr>
+          <w:rFonts w:ascii="Arial" w:hAnsi="Arial"/>
+          <w:sz w:val="28"/>
+          <w:szCs w:val="28"/>
+        </w:rPr>
+        <w:t>Botão “liga” quando pressionado (manter segurado)</w:t>
+      </w:r>
+    </w:p>
+    <w:p>
+      <w:pPr>
+        <w:rPr>
+          <w:rFonts w:ascii="Arial" w:hAnsi="Arial"/>
+          <w:sz w:val="28"/>
+          <w:szCs w:val="28"/>
+        </w:rPr>
+      </w:pPr>
+    </w:p>
+    <w:p>
+      <w:pPr>
+        <w:rPr>
+          <w:rFonts w:ascii="Arial" w:hAnsi="Arial"/>
+          <w:sz w:val="28"/>
+          <w:szCs w:val="28"/>
+        </w:rPr>
+      </w:pPr>
+      <w:r>
+        <w:rPr>
+          <w:rFonts w:ascii="Arial" w:hAnsi="Arial"/>
+          <w:b/>
+          <w:bCs/>
+          <w:sz w:val="28"/>
+          <w:szCs w:val="28"/>
+        </w:rPr>
+        <w:t>DEMONSTRAÇÃO</w:t>
+      </w:r>
+      <w:r>
+        <w:rPr>
+          <w:rFonts w:ascii="Arial" w:hAnsi="Arial"/>
+          <w:b/>
+          <w:bCs/>
+          <w:sz w:val="28"/>
+          <w:szCs w:val="28"/>
+        </w:rPr>
+        <w:t xml:space="preserve"> DA LIGAÇÃO</w:t>
+      </w:r>
+      <w:r>
+        <w:rPr>
+          <w:rFonts w:ascii="Arial" w:hAnsi="Arial"/>
+          <w:b/>
+          <w:bCs/>
+          <w:sz w:val="28"/>
+          <w:szCs w:val="28"/>
+        </w:rPr>
+        <w:t xml:space="preserve"> NO ARQUIVO </w:t>
+      </w:r>
+      <w:r>
+        <w:rPr>
+          <w:rFonts w:ascii="Arial" w:hAnsi="Arial"/>
+          <w:sz w:val="28"/>
+          <w:szCs w:val="28"/>
+        </w:rPr>
+        <w:t>aula_03_pushbutton_e_rgb</w:t>
+      </w:r>
+      <w:r>
+        <w:rPr>
+          <w:rFonts w:ascii="Arial" w:hAnsi="Arial"/>
+          <w:sz w:val="28"/>
+          <w:szCs w:val="28"/>
+        </w:rPr>
+        <w:t>.py</w:t>
+      </w:r>
+    </w:p>
+    <w:p>
+      <w:pPr>
+        <w:rPr>
+          <w:rFonts w:ascii="Arial" w:hAnsi="Arial"/>
+          <w:sz w:val="28"/>
+          <w:szCs w:val="28"/>
+        </w:rPr>
+      </w:pPr>
+      <w:r>
+        <w:rPr>
+          <w:rFonts w:ascii="Arial" w:hAnsi="Arial"/>
+          <w:sz w:val="28"/>
+          <w:szCs w:val="28"/>
+        </w:rPr>
+        <w:lastRenderedPageBreak/>
+        <w:drawing>
+          <wp:inline distT="0" distB="0" distL="0" distR="0" wp14:anchorId="03335421" wp14:editId="7AB85BC7">
+            <wp:extent cx="5400040" cy="3723005"/>
+            <wp:effectExtent l="0" t="0" r="0" b="0"/>
+            <wp:docPr id="924754736" name="Imagem 1"/>
+            <wp:cNvGraphicFramePr>
+              <a:graphicFrameLocks xmlns:a="http://schemas.openxmlformats.org/drawingml/2006/main" noChangeAspect="1"/>
+            </wp:cNvGraphicFramePr>
+            <a:graphic xmlns:a="http://schemas.openxmlformats.org/drawingml/2006/main">
+              <a:graphicData uri="http://schemas.openxmlformats.org/drawingml/2006/picture">
+                <pic:pic xmlns:pic="http://schemas.openxmlformats.org/drawingml/2006/picture">
+                  <pic:nvPicPr>
+                    <pic:cNvPr id="924754736" name=""/>
+                    <pic:cNvPicPr/>
+                  </pic:nvPicPr>
+                  <pic:blipFill>
+                    <a:blip r:embed="rId6"/>
+                    <a:stretch>
+                      <a:fillRect/>
+                    </a:stretch>
+                  </pic:blipFill>
+                  <pic:spPr>
+                    <a:xfrm>
+                      <a:off x="0" y="0"/>
+                      <a:ext cx="5400040" cy="3723005"/>
+                    </a:xfrm>
+                    <a:prstGeom prst="rect">
+                      <a:avLst/>
+                    </a:prstGeom>
+                  </pic:spPr>
+                </pic:pic>
+              </a:graphicData>
+            </a:graphic>
+          </wp:inline>
+        </w:drawing>
+      </w:r>
+    </w:p>
+    <w:p>
+      <w:pPr>
+        <w:rPr>
+          <w:rFonts w:ascii="Arial" w:hAnsi="Arial"/>
+          <w:sz w:val="28"/>
+          <w:szCs w:val="28"/>
+        </w:rPr>
+      </w:pPr>
+      <w:r>
+        <w:rPr>
+          <w:rFonts w:ascii="Arial" w:hAnsi="Arial"/>
+          <w:sz w:val="28"/>
+          <w:szCs w:val="28"/>
+        </w:rPr>
+        <w:t>LIGAÇÃO PULL-DOWN</w:t>
+      </w:r>
+    </w:p>
+    <w:p>
+      <w:pPr>
+        <w:rPr>
+          <w:rFonts w:ascii="Arial" w:hAnsi="Arial"/>
+          <w:sz w:val="28"/>
+          <w:szCs w:val="28"/>
+        </w:rPr>
+      </w:pPr>
+      <w:r>
+        <w:rPr>
+          <w:rFonts w:ascii="Arial" w:hAnsi="Arial"/>
+          <w:sz w:val="28"/>
+          <w:szCs w:val="28"/>
+        </w:rPr>
+        <w:t>- Resistor 10K Ohms</w:t>
+      </w:r>
+    </w:p>
+    <w:p>
+      <w:pPr>
+        <w:rPr>
+          <w:rFonts w:ascii="Arial" w:hAnsi="Arial"/>
+          <w:sz w:val="28"/>
+          <w:szCs w:val="28"/>
+        </w:rPr>
+      </w:pPr>
+    </w:p>
+    <w:p>
+      <w:pPr>
+        <w:rPr>
+          <w:rFonts w:ascii="Arial" w:hAnsi="Arial"/>
+          <w:sz w:val="28"/>
+          <w:szCs w:val="28"/>
+        </w:rPr>
+      </w:pPr>
+      <w:r>
+        <w:rPr>
+          <w:rFonts w:ascii="Arial" w:hAnsi="Arial"/>
+          <w:sz w:val="28"/>
+          <w:szCs w:val="28"/>
+        </w:rPr>
+        <w:drawing>
+          <wp:inline distT="0" distB="0" distL="0" distR="0" wp14:anchorId="5F531F52" wp14:editId="3C3CE75D">
+            <wp:extent cx="5400040" cy="3260090"/>
+            <wp:effectExtent l="0" t="0" r="0" b="0"/>
+            <wp:docPr id="405939429" name="Imagem 1"/>
+            <wp:cNvGraphicFramePr>
+              <a:graphicFrameLocks xmlns:a="http://schemas.openxmlformats.org/drawingml/2006/main" noChangeAspect="1"/>
+            </wp:cNvGraphicFramePr>
+            <a:graphic xmlns:a="http://schemas.openxmlformats.org/drawingml/2006/main">
+              <a:graphicData uri="http://schemas.openxmlformats.org/drawingml/2006/picture">
+                <pic:pic xmlns:pic="http://schemas.openxmlformats.org/drawingml/2006/picture">
+                  <pic:nvPicPr>
+                    <pic:cNvPr id="405939429" name=""/>
+                    <pic:cNvPicPr/>
+                  </pic:nvPicPr>
+                  <pic:blipFill>
+                    <a:blip r:embed="rId7"/>
+                    <a:stretch>
+                      <a:fillRect/>
+                    </a:stretch>
+                  </pic:blipFill>
+                  <pic:spPr>
+                    <a:xfrm>
+                      <a:off x="0" y="0"/>
+                      <a:ext cx="5400040" cy="3260090"/>
+                    </a:xfrm>
+                    <a:prstGeom prst="rect">
+                      <a:avLst/>
+                    </a:prstGeom>
+                  </pic:spPr>
+                </pic:pic>
+              </a:graphicData>
+            </a:graphic>
+          </wp:inline>
+        </w:drawing>
+      </w:r>
+    </w:p>
+    <w:p>
+      <w:pPr>
+        <w:rPr>
+          <w:rFonts w:ascii="Arial" w:hAnsi="Arial"/>
+          <w:sz w:val="28"/>
+          <w:szCs w:val="28"/>
+        </w:rPr>
+      </w:pPr>
+      <w:r>
+        <w:rPr>
+          <w:rFonts w:ascii="Arial" w:hAnsi="Arial"/>
+          <w:sz w:val="28"/>
+          <w:szCs w:val="28"/>
+        </w:rPr>
+        <w:t>LIGAÇÃO PULL-UP</w:t>
+      </w:r>
+    </w:p>
+    <w:p>
+      <w:pPr>
+        <w:rPr>
+          <w:rFonts w:ascii="Arial" w:hAnsi="Arial"/>
+          <w:sz w:val="28"/>
+          <w:szCs w:val="28"/>
+        </w:rPr>
+      </w:pPr>
     </w:p>
     <w:sectPr>
       <w:pgSz w:w="11906" w:h="16838"/>

</xml_diff>

<commit_message>
Aula 1603 - IoT e Aula 1903 - BACK - Adição de Salas na API CINEMA
</commit_message>
<xml_diff>
--- a/SENAI/WORDS/3º SEMESTRE/IoT/aula03_revisao_rasp.docx
+++ b/SENAI/WORDS/3º SEMESTRE/IoT/aula03_revisao_rasp.docx
@@ -65,10 +65,12 @@
           <w:sz w:val="32"/>
           <w:szCs w:val="32"/>
         </w:rPr>
-        <w:t xml:space="preserve">Revisão e Prática </w:t>
-      </w:r>
-      <w:proofErr w:type="spellStart"/>
-      <w:r>
+        <w:t>Revisão e Prática Rasp</w:t>
+      </w:r>
+    </w:p>
+    <w:p>
+      <w:pPr>
+        <w:jc w:val="center"/>
         <w:rPr>
           <w:rFonts w:ascii="Arial" w:hAnsi="Arial"/>
           <w:b/>
@@ -76,97 +78,49 @@
           <w:sz w:val="32"/>
           <w:szCs w:val="32"/>
         </w:rPr>
-        <w:t>Rasp</w:t>
-      </w:r>
-      <w:proofErr w:type="spellEnd"/>
-    </w:p>
-    <w:p>
-      <w:pPr>
-        <w:jc w:val="center"/>
-        <w:rPr>
-          <w:rFonts w:ascii="Arial" w:hAnsi="Arial"/>
-          <w:b/>
-          <w:bCs/>
-          <w:sz w:val="32"/>
-          <w:szCs w:val="32"/>
-        </w:rPr>
-      </w:pPr>
-    </w:p>
-    <w:p>
-      <w:pPr>
-        <w:rPr>
-          <w:rFonts w:ascii="Arial" w:hAnsi="Arial"/>
-          <w:b/>
-          <w:bCs/>
-          <w:sz w:val="28"/>
-          <w:szCs w:val="28"/>
-        </w:rPr>
-      </w:pPr>
-      <w:r>
-        <w:rPr>
-          <w:rFonts w:ascii="Arial" w:hAnsi="Arial"/>
-          <w:b/>
-          <w:bCs/>
-          <w:sz w:val="28"/>
-          <w:szCs w:val="28"/>
-        </w:rPr>
-        <w:t xml:space="preserve">Revisão de conceitos – </w:t>
-      </w:r>
-      <w:proofErr w:type="spellStart"/>
-      <w:r>
-        <w:rPr>
-          <w:rFonts w:ascii="Arial" w:hAnsi="Arial"/>
-          <w:b/>
-          <w:bCs/>
-          <w:sz w:val="28"/>
-          <w:szCs w:val="28"/>
-        </w:rPr>
-        <w:t>Micropython</w:t>
-      </w:r>
-      <w:proofErr w:type="spellEnd"/>
-      <w:r>
-        <w:rPr>
-          <w:rFonts w:ascii="Arial" w:hAnsi="Arial"/>
-          <w:b/>
-          <w:bCs/>
-          <w:sz w:val="28"/>
-          <w:szCs w:val="28"/>
-        </w:rPr>
-        <w:t>, Sensores, Atuadores, Resistores e PWM</w:t>
-      </w:r>
-    </w:p>
-    <w:p>
-      <w:pPr>
-        <w:rPr>
-          <w:rFonts w:ascii="Arial" w:hAnsi="Arial"/>
-          <w:b/>
-          <w:bCs/>
-          <w:sz w:val="28"/>
-          <w:szCs w:val="28"/>
-        </w:rPr>
-      </w:pPr>
-      <w:r>
-        <w:rPr>
-          <w:rFonts w:ascii="Arial" w:hAnsi="Arial"/>
-          <w:b/>
-          <w:bCs/>
-          <w:sz w:val="28"/>
-          <w:szCs w:val="28"/>
-        </w:rPr>
-        <w:t xml:space="preserve">Exercício semáforo feito no </w:t>
-      </w:r>
-      <w:proofErr w:type="spellStart"/>
-      <w:r>
-        <w:rPr>
-          <w:rFonts w:ascii="Arial" w:hAnsi="Arial"/>
-          <w:b/>
-          <w:bCs/>
-          <w:sz w:val="28"/>
-          <w:szCs w:val="28"/>
-        </w:rPr>
-        <w:t>Thonny</w:t>
-      </w:r>
-      <w:proofErr w:type="spellEnd"/>
+      </w:pPr>
+    </w:p>
+    <w:p>
+      <w:pPr>
+        <w:rPr>
+          <w:rFonts w:ascii="Arial" w:hAnsi="Arial"/>
+          <w:b/>
+          <w:bCs/>
+          <w:sz w:val="28"/>
+          <w:szCs w:val="28"/>
+        </w:rPr>
+      </w:pPr>
+      <w:r>
+        <w:rPr>
+          <w:rFonts w:ascii="Arial" w:hAnsi="Arial"/>
+          <w:b/>
+          <w:bCs/>
+          <w:sz w:val="28"/>
+          <w:szCs w:val="28"/>
+        </w:rPr>
+        <w:t>Revisão de conceitos – Micropython, Sensores, Atuadores, Resistores e PWM</w:t>
+      </w:r>
+    </w:p>
+    <w:p>
+      <w:pPr>
+        <w:rPr>
+          <w:rFonts w:ascii="Arial" w:hAnsi="Arial"/>
+          <w:b/>
+          <w:bCs/>
+          <w:sz w:val="28"/>
+          <w:szCs w:val="28"/>
+        </w:rPr>
+      </w:pPr>
+      <w:r>
+        <w:rPr>
+          <w:rFonts w:ascii="Arial" w:hAnsi="Arial"/>
+          <w:b/>
+          <w:bCs/>
+          <w:sz w:val="28"/>
+          <w:szCs w:val="28"/>
+        </w:rPr>
+        <w:t>Exercício semáforo feito no Thonny</w:t>
+      </w:r>
     </w:p>
     <w:p>
       <w:pPr>
@@ -321,33 +275,13 @@
           <w:szCs w:val="28"/>
         </w:rPr>
       </w:pPr>
-      <w:proofErr w:type="spellStart"/>
-      <w:proofErr w:type="gramStart"/>
-      <w:r>
-        <w:rPr>
-          <w:rFonts w:ascii="Arial" w:hAnsi="Arial"/>
-          <w:sz w:val="28"/>
-          <w:szCs w:val="28"/>
-        </w:rPr>
-        <w:t>Concat</w:t>
-      </w:r>
-      <w:proofErr w:type="spellEnd"/>
-      <w:r>
-        <w:rPr>
-          <w:rFonts w:ascii="Arial" w:hAnsi="Arial"/>
-          <w:sz w:val="28"/>
-          <w:szCs w:val="28"/>
-        </w:rPr>
-        <w:t>(</w:t>
-      </w:r>
-      <w:proofErr w:type="gramEnd"/>
-      <w:r>
-        <w:rPr>
-          <w:rFonts w:ascii="Arial" w:hAnsi="Arial"/>
-          <w:sz w:val="28"/>
-          <w:szCs w:val="28"/>
-        </w:rPr>
-        <w:t>1(faixa marrom), 6(faixa azul)</w:t>
+      <w:r>
+        <w:rPr>
+          <w:rFonts w:ascii="Arial" w:hAnsi="Arial"/>
+          <w:sz w:val="28"/>
+          <w:szCs w:val="28"/>
+        </w:rPr>
+        <w:t>Concat(1(faixa marrom), 6(faixa azul)</w:t>
       </w:r>
       <w:r>
         <w:rPr>
@@ -531,25 +465,7 @@
           <w:sz w:val="28"/>
           <w:szCs w:val="28"/>
         </w:rPr>
-        <w:t xml:space="preserve">Captam informações do ambiente e transformam em sinais elétricos que são enviados ao microcontrolador (normalmente </w:t>
-      </w:r>
-      <w:proofErr w:type="spellStart"/>
-      <w:r>
-        <w:rPr>
-          <w:rFonts w:ascii="Arial" w:hAnsi="Arial"/>
-          <w:sz w:val="28"/>
-          <w:szCs w:val="28"/>
-        </w:rPr>
-        <w:t>usado</w:t>
-      </w:r>
-      <w:proofErr w:type="spellEnd"/>
-      <w:r>
-        <w:rPr>
-          <w:rFonts w:ascii="Arial" w:hAnsi="Arial"/>
-          <w:sz w:val="28"/>
-          <w:szCs w:val="28"/>
-        </w:rPr>
-        <w:t xml:space="preserve"> para </w:t>
+        <w:t xml:space="preserve">Captam informações do ambiente e transformam em sinais elétricos que são enviados ao microcontrolador (normalmente usado para </w:t>
       </w:r>
       <w:r>
         <w:rPr>
@@ -592,7 +508,6 @@
         </w:rPr>
         <w:t xml:space="preserve">, </w:t>
       </w:r>
-      <w:proofErr w:type="spellStart"/>
       <w:r>
         <w:rPr>
           <w:rFonts w:ascii="Arial" w:hAnsi="Arial"/>
@@ -609,7 +524,6 @@
         </w:rPr>
         <w:t>ushbutton</w:t>
       </w:r>
-      <w:proofErr w:type="spellEnd"/>
       <w:r>
         <w:rPr>
           <w:rFonts w:ascii="Arial" w:hAnsi="Arial"/>
@@ -636,7 +550,6 @@
           <w:szCs w:val="28"/>
         </w:rPr>
       </w:pPr>
-      <w:proofErr w:type="spellStart"/>
       <w:r>
         <w:rPr>
           <w:rFonts w:ascii="Arial" w:hAnsi="Arial"/>
@@ -647,33 +560,22 @@
         </w:rPr>
         <w:t>Pushbutton</w:t>
       </w:r>
-      <w:proofErr w:type="spellEnd"/>
-    </w:p>
-    <w:p>
-      <w:pPr>
-        <w:rPr>
-          <w:rFonts w:ascii="Arial" w:hAnsi="Arial"/>
-          <w:sz w:val="28"/>
-          <w:szCs w:val="28"/>
-        </w:rPr>
-      </w:pPr>
-      <w:proofErr w:type="spellStart"/>
-      <w:r>
-        <w:rPr>
-          <w:rFonts w:ascii="Arial" w:hAnsi="Arial"/>
-          <w:sz w:val="28"/>
-          <w:szCs w:val="28"/>
-        </w:rPr>
-        <w:t>Pull-Up</w:t>
-      </w:r>
-      <w:proofErr w:type="spellEnd"/>
-      <w:r>
-        <w:rPr>
-          <w:rFonts w:ascii="Arial" w:hAnsi="Arial"/>
-          <w:sz w:val="28"/>
-          <w:szCs w:val="28"/>
-        </w:rPr>
-        <w:t xml:space="preserve">: Botão se mantém </w:t>
+    </w:p>
+    <w:p>
+      <w:pPr>
+        <w:rPr>
+          <w:rFonts w:ascii="Arial" w:hAnsi="Arial"/>
+          <w:sz w:val="28"/>
+          <w:szCs w:val="28"/>
+        </w:rPr>
+      </w:pPr>
+      <w:r>
+        <w:rPr>
+          <w:rFonts w:ascii="Arial" w:hAnsi="Arial"/>
+          <w:sz w:val="28"/>
+          <w:szCs w:val="28"/>
+        </w:rPr>
+        <w:t xml:space="preserve">Pull-Up: Botão se mantém </w:t>
       </w:r>
       <w:r>
         <w:rPr>
@@ -724,23 +626,13 @@
           <w:szCs w:val="28"/>
         </w:rPr>
       </w:pPr>
-      <w:proofErr w:type="spellStart"/>
-      <w:r>
-        <w:rPr>
-          <w:rFonts w:ascii="Arial" w:hAnsi="Arial"/>
-          <w:sz w:val="28"/>
-          <w:szCs w:val="28"/>
-        </w:rPr>
-        <w:t>Pull</w:t>
-      </w:r>
-      <w:proofErr w:type="spellEnd"/>
-      <w:r>
-        <w:rPr>
-          <w:rFonts w:ascii="Arial" w:hAnsi="Arial"/>
-          <w:sz w:val="28"/>
-          <w:szCs w:val="28"/>
-        </w:rPr>
-        <w:t xml:space="preserve">-Down: </w:t>
+      <w:r>
+        <w:rPr>
+          <w:rFonts w:ascii="Arial" w:hAnsi="Arial"/>
+          <w:sz w:val="28"/>
+          <w:szCs w:val="28"/>
+        </w:rPr>
+        <w:t xml:space="preserve">Pull-Down: </w:t>
       </w:r>
       <w:r>
         <w:rPr>
@@ -826,6 +718,7 @@
       <w:r>
         <w:rPr>
           <w:rFonts w:ascii="Arial" w:hAnsi="Arial"/>
+          <w:noProof/>
           <w:sz w:val="28"/>
           <w:szCs w:val="28"/>
         </w:rPr>
@@ -873,13 +766,15 @@
           <w:rFonts w:ascii="Arial" w:hAnsi="Arial"/>
           <w:sz w:val="28"/>
           <w:szCs w:val="28"/>
-        </w:rPr>
-      </w:pPr>
-      <w:r>
-        <w:rPr>
-          <w:rFonts w:ascii="Arial" w:hAnsi="Arial"/>
-          <w:sz w:val="28"/>
-          <w:szCs w:val="28"/>
+          <w:lang w:val="en-US"/>
+        </w:rPr>
+      </w:pPr>
+      <w:r>
+        <w:rPr>
+          <w:rFonts w:ascii="Arial" w:hAnsi="Arial"/>
+          <w:sz w:val="28"/>
+          <w:szCs w:val="28"/>
+          <w:lang w:val="en-US"/>
         </w:rPr>
         <w:t>LIGAÇÃO PULL-DOWN</w:t>
       </w:r>
@@ -890,13 +785,15 @@
           <w:rFonts w:ascii="Arial" w:hAnsi="Arial"/>
           <w:sz w:val="28"/>
           <w:szCs w:val="28"/>
-        </w:rPr>
-      </w:pPr>
-      <w:r>
-        <w:rPr>
-          <w:rFonts w:ascii="Arial" w:hAnsi="Arial"/>
-          <w:sz w:val="28"/>
-          <w:szCs w:val="28"/>
+          <w:lang w:val="en-US"/>
+        </w:rPr>
+      </w:pPr>
+      <w:r>
+        <w:rPr>
+          <w:rFonts w:ascii="Arial" w:hAnsi="Arial"/>
+          <w:sz w:val="28"/>
+          <w:szCs w:val="28"/>
+          <w:lang w:val="en-US"/>
         </w:rPr>
         <w:t>- Resistor 10K Ohms</w:t>
       </w:r>
@@ -907,20 +804,22 @@
           <w:rFonts w:ascii="Arial" w:hAnsi="Arial"/>
           <w:sz w:val="28"/>
           <w:szCs w:val="28"/>
-        </w:rPr>
-      </w:pPr>
-    </w:p>
-    <w:p>
-      <w:pPr>
-        <w:rPr>
-          <w:rFonts w:ascii="Arial" w:hAnsi="Arial"/>
-          <w:sz w:val="28"/>
-          <w:szCs w:val="28"/>
-        </w:rPr>
-      </w:pPr>
-      <w:r>
-        <w:rPr>
-          <w:rFonts w:ascii="Arial" w:hAnsi="Arial"/>
+          <w:lang w:val="en-US"/>
+        </w:rPr>
+      </w:pPr>
+    </w:p>
+    <w:p>
+      <w:pPr>
+        <w:rPr>
+          <w:rFonts w:ascii="Arial" w:hAnsi="Arial"/>
+          <w:sz w:val="28"/>
+          <w:szCs w:val="28"/>
+        </w:rPr>
+      </w:pPr>
+      <w:r>
+        <w:rPr>
+          <w:rFonts w:ascii="Arial" w:hAnsi="Arial"/>
+          <w:noProof/>
           <w:sz w:val="28"/>
           <w:szCs w:val="28"/>
         </w:rPr>
@@ -986,6 +885,238 @@
           <w:szCs w:val="28"/>
         </w:rPr>
       </w:pPr>
+    </w:p>
+    <w:p>
+      <w:pPr>
+        <w:rPr>
+          <w:rFonts w:ascii="Arial" w:hAnsi="Arial"/>
+          <w:b/>
+          <w:bCs/>
+          <w:sz w:val="28"/>
+          <w:szCs w:val="28"/>
+        </w:rPr>
+      </w:pPr>
+      <w:r>
+        <w:rPr>
+          <w:rFonts w:ascii="Arial" w:hAnsi="Arial"/>
+          <w:b/>
+          <w:bCs/>
+          <w:sz w:val="28"/>
+          <w:szCs w:val="28"/>
+        </w:rPr>
+        <w:lastRenderedPageBreak/>
+        <w:t>PWM</w:t>
+      </w:r>
+    </w:p>
+    <w:p>
+      <w:pPr>
+        <w:rPr>
+          <w:rFonts w:ascii="Arial" w:hAnsi="Arial"/>
+          <w:sz w:val="28"/>
+          <w:szCs w:val="28"/>
+        </w:rPr>
+      </w:pPr>
+      <w:r>
+        <w:rPr>
+          <w:rFonts w:ascii="Arial" w:hAnsi="Arial"/>
+          <w:sz w:val="28"/>
+          <w:szCs w:val="28"/>
+        </w:rPr>
+        <w:t>PWM significa Pulse Width Modulation (Modulação por Largura de Pulso). É uma técnica usada</w:t>
+      </w:r>
+      <w:r>
+        <w:rPr>
+          <w:rFonts w:ascii="Arial" w:hAnsi="Arial"/>
+          <w:sz w:val="28"/>
+          <w:szCs w:val="28"/>
+        </w:rPr>
+        <w:t xml:space="preserve"> </w:t>
+      </w:r>
+      <w:r>
+        <w:rPr>
+          <w:rFonts w:ascii="Arial" w:hAnsi="Arial"/>
+          <w:sz w:val="28"/>
+          <w:szCs w:val="28"/>
+        </w:rPr>
+        <w:t>para simular sinais analógicos usando sinais digitais.</w:t>
+      </w:r>
+    </w:p>
+    <w:p>
+      <w:pPr>
+        <w:rPr>
+          <w:rFonts w:ascii="Arial" w:hAnsi="Arial"/>
+          <w:sz w:val="28"/>
+          <w:szCs w:val="28"/>
+        </w:rPr>
+      </w:pPr>
+      <w:r>
+        <w:rPr>
+          <w:rFonts w:ascii="Arial" w:hAnsi="Arial"/>
+          <w:sz w:val="28"/>
+          <w:szCs w:val="28"/>
+        </w:rPr>
+        <w:t>O sinal digital oscila entre 0V e 3.3V rapidamente.</w:t>
+      </w:r>
+      <w:r>
+        <w:rPr>
+          <w:rFonts w:ascii="Arial" w:hAnsi="Arial"/>
+          <w:sz w:val="28"/>
+          <w:szCs w:val="28"/>
+        </w:rPr>
+        <w:t xml:space="preserve"> </w:t>
+      </w:r>
+      <w:r>
+        <w:rPr>
+          <w:rFonts w:ascii="Arial" w:hAnsi="Arial"/>
+          <w:sz w:val="28"/>
+          <w:szCs w:val="28"/>
+        </w:rPr>
+        <w:t>O tempo em que o sinal permanece ligado (ON) em</w:t>
+      </w:r>
+      <w:r>
+        <w:rPr>
+          <w:rFonts w:ascii="Arial" w:hAnsi="Arial"/>
+          <w:sz w:val="28"/>
+          <w:szCs w:val="28"/>
+        </w:rPr>
+        <w:t xml:space="preserve"> </w:t>
+      </w:r>
+      <w:r>
+        <w:rPr>
+          <w:rFonts w:ascii="Arial" w:hAnsi="Arial"/>
+          <w:sz w:val="28"/>
+          <w:szCs w:val="28"/>
+        </w:rPr>
+        <w:t>cada ciclo é chamado de "duty cycle".</w:t>
+      </w:r>
+    </w:p>
+    <w:p>
+      <w:pPr>
+        <w:rPr>
+          <w:rFonts w:ascii="Arial" w:hAnsi="Arial"/>
+          <w:sz w:val="28"/>
+          <w:szCs w:val="28"/>
+        </w:rPr>
+      </w:pPr>
+      <w:r>
+        <w:rPr>
+          <w:rFonts w:ascii="Arial" w:hAnsi="Arial"/>
+          <w:sz w:val="28"/>
+          <w:szCs w:val="28"/>
+        </w:rPr>
+        <w:t xml:space="preserve">O </w:t>
+      </w:r>
+      <w:r>
+        <w:rPr>
+          <w:rFonts w:ascii="Arial" w:hAnsi="Arial"/>
+          <w:b/>
+          <w:bCs/>
+          <w:sz w:val="28"/>
+          <w:szCs w:val="28"/>
+        </w:rPr>
+        <w:t xml:space="preserve">PWM </w:t>
+      </w:r>
+      <w:r>
+        <w:rPr>
+          <w:rFonts w:ascii="Arial" w:hAnsi="Arial"/>
+          <w:sz w:val="28"/>
+          <w:szCs w:val="28"/>
+        </w:rPr>
+        <w:t xml:space="preserve">pode ser utilizado para controlar a intensidade de </w:t>
+      </w:r>
+      <w:r>
+        <w:rPr>
+          <w:rFonts w:ascii="Arial" w:hAnsi="Arial"/>
+          <w:sz w:val="28"/>
+          <w:szCs w:val="28"/>
+        </w:rPr>
+        <w:t>LEDs, velocidade de motores, etc.</w:t>
+      </w:r>
+    </w:p>
+    <w:p>
+      <w:pPr>
+        <w:rPr>
+          <w:rFonts w:ascii="Arial" w:hAnsi="Arial"/>
+          <w:sz w:val="28"/>
+          <w:szCs w:val="28"/>
+        </w:rPr>
+      </w:pPr>
+      <w:r>
+        <w:rPr>
+          <w:rFonts w:ascii="Arial" w:hAnsi="Arial"/>
+          <w:sz w:val="28"/>
+          <w:szCs w:val="28"/>
+        </w:rPr>
+        <w:t>Ex.:</w:t>
+      </w:r>
+    </w:p>
+    <w:p>
+      <w:pPr>
+        <w:rPr>
+          <w:rFonts w:ascii="Arial" w:hAnsi="Arial"/>
+          <w:sz w:val="28"/>
+          <w:szCs w:val="28"/>
+        </w:rPr>
+      </w:pPr>
+      <w:r>
+        <w:rPr>
+          <w:rFonts w:ascii="Arial" w:hAnsi="Arial"/>
+          <w:sz w:val="28"/>
+          <w:szCs w:val="28"/>
+        </w:rPr>
+        <w:drawing>
+          <wp:inline distT="0" distB="0" distL="0" distR="0" wp14:anchorId="06C89EF6" wp14:editId="5986EEE6">
+            <wp:extent cx="5363323" cy="2152950"/>
+            <wp:effectExtent l="0" t="0" r="8890" b="0"/>
+            <wp:docPr id="855847386" name="Imagem 1"/>
+            <wp:cNvGraphicFramePr>
+              <a:graphicFrameLocks xmlns:a="http://schemas.openxmlformats.org/drawingml/2006/main" noChangeAspect="1"/>
+            </wp:cNvGraphicFramePr>
+            <a:graphic xmlns:a="http://schemas.openxmlformats.org/drawingml/2006/main">
+              <a:graphicData uri="http://schemas.openxmlformats.org/drawingml/2006/picture">
+                <pic:pic xmlns:pic="http://schemas.openxmlformats.org/drawingml/2006/picture">
+                  <pic:nvPicPr>
+                    <pic:cNvPr id="855847386" name=""/>
+                    <pic:cNvPicPr/>
+                  </pic:nvPicPr>
+                  <pic:blipFill>
+                    <a:blip r:embed="rId8"/>
+                    <a:stretch>
+                      <a:fillRect/>
+                    </a:stretch>
+                  </pic:blipFill>
+                  <pic:spPr>
+                    <a:xfrm>
+                      <a:off x="0" y="0"/>
+                      <a:ext cx="5363323" cy="2152950"/>
+                    </a:xfrm>
+                    <a:prstGeom prst="rect">
+                      <a:avLst/>
+                    </a:prstGeom>
+                  </pic:spPr>
+                </pic:pic>
+              </a:graphicData>
+            </a:graphic>
+          </wp:inline>
+        </w:drawing>
+      </w:r>
+    </w:p>
+    <w:p>
+      <w:pPr>
+        <w:rPr>
+          <w:rFonts w:ascii="Arial" w:hAnsi="Arial"/>
+          <w:sz w:val="28"/>
+          <w:szCs w:val="28"/>
+        </w:rPr>
+      </w:pPr>
+      <w:r>
+        <w:rPr>
+          <w:rFonts w:ascii="Arial" w:hAnsi="Arial"/>
+          <w:sz w:val="28"/>
+          <w:szCs w:val="28"/>
+        </w:rPr>
+        <w:t>PWM tem que ser importado</w:t>
+      </w:r>
     </w:p>
     <w:sectPr>
       <w:pgSz w:w="11906" w:h="16838"/>

</xml_diff>